<commit_message>
checkpoint: detailed construction prompts + real fal.ai video progress feedback
</commit_message>
<xml_diff>
--- a/assets/0. Projects/NEXT_Gift_Card_Campaign/NEXT_Gift_Card_Campaign_Screenplay.docx
+++ b/assets/0. Projects/NEXT_Gift_Card_Campaign/NEXT_Gift_Card_Campaign_Screenplay.docx
@@ -23,7 +23,7 @@
           <w:sz w:val="18"/>
           <w:szCs w:val="18"/>
         </w:rPr>
-        <w:t xml:space="preserve">Approved: 07/03/2026 — TensorAx Studio</w:t>
+        <w:t xml:space="preserve">Approved: 10/03/2026 — TensorAx Studio</w:t>
       </w:r>
     </w:p>
     <w:p/>
@@ -36,7 +36,7 @@
           <w:b/>
           <w:bCs/>
         </w:rPr>
-        <w:t xml:space="preserve">A Gift for Every Moment: NEXT Generations</w:t>
+        <w:t xml:space="preserve">Response</w:t>
       </w:r>
     </w:p>
     <w:p>
@@ -48,7 +48,70 @@
           <w:b/>
           <w:bCs/>
         </w:rPr>
-        <w:t xml:space="preserve">Idea 1: A Gift for Every Moment: NEXT Generations</w:t>
+        <w:t xml:space="preserve">Idea: Един Подарък за Всеки Момент (One Gift for Every Moment)</w:t>
+      </w:r>
+    </w:p>
+    <w:p>
+      <w:r>
+        <w:rPr>
+          <w:b/>
+          <w:bCs/>
+          <w:sz w:val="22"/>
+          <w:szCs w:val="22"/>
+        </w:rPr>
+        <w:t xml:space="preserve">Summary:</w:t>
+      </w:r>
+      <w:r>
+        <w:rPr>
+          <w:sz w:val="22"/>
+          <w:szCs w:val="22"/>
+        </w:rPr>
+        <w:t xml:space="preserve"> This concept faithfully recreates the heartwarming journey of a child growing up, as seen in Style Inspiration 1, adapting it for a vertical 9:16 format. The core creative output is a warm Bulgarian voiceover, precisely timed for the 49-second duration of the inspirational video, highlighting the joy of childhood milestones and positioning the NEXT Gift Card as the perfect, flexible present for every stage of a child's rapid growth.</w:t>
+      </w:r>
+    </w:p>
+    <w:p>
+      <w:r>
+        <w:rPr>
+          <w:b/>
+          <w:bCs/>
+          <w:sz w:val="22"/>
+          <w:szCs w:val="22"/>
+        </w:rPr>
+        <w:t xml:space="preserve">Scene 1:</w:t>
+      </w:r>
+      <w:r>
+        <w:rPr>
+          <w:sz w:val="22"/>
+          <w:szCs w:val="22"/>
+        </w:rPr>
+        <w:t xml:space="preserve"> (0-5s)</w:t>
+      </w:r>
+    </w:p>
+    <w:p>
+      <w:r>
+        <w:rPr>
+          <w:sz w:val="22"/>
+          <w:szCs w:val="22"/>
+        </w:rPr>
+        <w:t xml:space="preserve">A soft focus close-up on a newborn baby's tiny hand grasping a parent's finger. The camera then gently pulls back to reveal tender moments between new parents and their infant – a gentle kiss on the forehead, rocking the baby, soft cuddles. The lighting is warm and natural, evoking pure love and the start of a new journey.</w:t>
+      </w:r>
+    </w:p>
+    <w:p>
+      <w:r>
+        <w:rPr>
+          <w:b/>
+          <w:bCs/>
+          <w:sz w:val="22"/>
+          <w:szCs w:val="22"/>
+        </w:rPr>
+        <w:t xml:space="preserve">VO:</w:t>
+      </w:r>
+      <w:r>
+        <w:rPr>
+          <w:sz w:val="22"/>
+          <w:szCs w:val="22"/>
+        </w:rPr>
+        <w:t xml:space="preserve"> Един нов живот. Едно ново начало, изпълнено с обич и нежност. (A new life. A new beginning, filled with love and tenderness.)</w:t>
       </w:r>
     </w:p>
     <w:p/>
@@ -60,14 +123,41 @@
           <w:sz w:val="22"/>
           <w:szCs w:val="22"/>
         </w:rPr>
-        <w:t xml:space="preserve">Summary:</w:t>
-      </w:r>
-      <w:r>
-        <w:rPr>
-          <w:sz w:val="22"/>
-          <w:szCs w:val="22"/>
-        </w:rPr>
-        <w:t xml:space="preserve"> This video traces the growth of a child from infancy to pre-teen years, always dressed in stylish NEXT outfits. Each stage features a different loving relative or family friend presenting a NEXT Gift Card, followed by a scene with them and the child, emphasizing that these precious outfits and memories are gifts from loved ones. It highlights the enduring value and thoughtfulness of a NEXT Gift Card through the child's journey, directly incorporating the user's feedback about different adults and gift cards from loved ones.</w:t>
+        <w:t xml:space="preserve">Scene 2:</w:t>
+      </w:r>
+      <w:r>
+        <w:rPr>
+          <w:sz w:val="22"/>
+          <w:szCs w:val="22"/>
+        </w:rPr>
+        <w:t xml:space="preserve"> (5-15s)</w:t>
+      </w:r>
+    </w:p>
+    <w:p>
+      <w:r>
+        <w:rPr>
+          <w:sz w:val="22"/>
+          <w:szCs w:val="22"/>
+        </w:rPr>
+        <w:t xml:space="preserve">Quick cuts showcasing a toddler's milestones: wobbly first steps, giggling during playful moments, discovering new textures, blowing bubbles. We see glimpses of small, thoughtful gifts – soft clothes, a simple toy – from family members. Each moment is captured with a joyful, intimate feel.</w:t>
+      </w:r>
+    </w:p>
+    <w:p>
+      <w:r>
+        <w:rPr>
+          <w:b/>
+          <w:bCs/>
+          <w:sz w:val="22"/>
+          <w:szCs w:val="22"/>
+        </w:rPr>
+        <w:t xml:space="preserve">VO:</w:t>
+      </w:r>
+      <w:r>
+        <w:rPr>
+          <w:sz w:val="22"/>
+          <w:szCs w:val="22"/>
+        </w:rPr>
+        <w:t xml:space="preserve"> Всяка усмивка, всяка първа крачка е празник. А подаръците от близките – част от магията. (Every smile, every first step is a celebration. And gifts from loved ones – part of the magic.)</w:t>
       </w:r>
     </w:p>
     <w:p/>
@@ -79,132 +169,41 @@
           <w:sz w:val="22"/>
           <w:szCs w:val="22"/>
         </w:rPr>
-        <w:t xml:space="preserve">Key Scenes:</w:t>
-      </w:r>
-    </w:p>
-    <w:p>
-      <w:r>
-        <w:rPr>
-          <w:sz w:val="22"/>
-          <w:szCs w:val="22"/>
-        </w:rPr>
-        <w:t xml:space="preserve">1.  </w:t>
-      </w:r>
-      <w:r>
-        <w:rPr>
-          <w:b/>
-          <w:bCs/>
-          <w:sz w:val="22"/>
-          <w:szCs w:val="22"/>
-        </w:rPr>
-        <w:t xml:space="preserve">The First Gift:</w:t>
-      </w:r>
-      <w:r>
-        <w:rPr>
-          <w:sz w:val="22"/>
-          <w:szCs w:val="22"/>
-        </w:rPr>
-        <w:t xml:space="preserve"> Opens with a warm, close-up shot of a hand (Grandma's) presenting a shining NEXT Gift Card. A quick transition then shows Grandma entering the frame, lovingly cradling a newborn baby (child age 0-1) dressed in a pristine white NEXT sleepsuit, smiling warmly. On-screen text (Next Display Extended Bold, white on black): "THE GIFT OF FIRSTS."</w:t>
-      </w:r>
-    </w:p>
-    <w:p>
-      <w:r>
-        <w:rPr>
-          <w:sz w:val="22"/>
-          <w:szCs w:val="22"/>
-        </w:rPr>
-        <w:t xml:space="preserve">2.  </w:t>
-      </w:r>
-      <w:r>
-        <w:rPr>
-          <w:b/>
-          <w:bCs/>
-          <w:sz w:val="22"/>
-          <w:szCs w:val="22"/>
-        </w:rPr>
-        <w:t xml:space="preserve">Playful Steps, Aunt's Joy:</w:t>
-      </w:r>
-      <w:r>
-        <w:rPr>
-          <w:sz w:val="22"/>
-          <w:szCs w:val="22"/>
-        </w:rPr>
-        <w:t xml:space="preserve"> A new shot of a different hand (Aunt's) presenting another NEXT Gift Card. The Aunt then enters the frame, laughing as she guides the same child (age 2-3), now a playful toddler in a colourful NEXT dungaree set, taking wobbly steps. On-screen text (Next Display Extended Medium, white on black): "LOVED ONES MAKE MEMORIES."</w:t>
-      </w:r>
-    </w:p>
-    <w:p>
-      <w:r>
-        <w:rPr>
-          <w:sz w:val="22"/>
-          <w:szCs w:val="22"/>
-        </w:rPr>
-        <w:t xml:space="preserve">3.  </w:t>
-      </w:r>
-      <w:r>
-        <w:rPr>
-          <w:b/>
-          <w:bCs/>
-          <w:sz w:val="22"/>
-          <w:szCs w:val="22"/>
-        </w:rPr>
-        <w:t xml:space="preserve">Confident Explorer, Friend's Fun:</w:t>
-      </w:r>
-      <w:r>
-        <w:rPr>
-          <w:sz w:val="22"/>
-          <w:szCs w:val="22"/>
-        </w:rPr>
-        <w:t xml:space="preserve"> Another distinct hand (a family friend's) presents a NEXT Gift Card. The Family Friend then enters the frame with the child (age 5-6 in a vibrant NEXT jacket), playfully chasing them through a park, sharing a joyful high-five. On-screen text (Next Display Extended Bold, white on black): "STYLE THAT GROWS WITH THEM."</w:t>
-      </w:r>
-    </w:p>
-    <w:p>
-      <w:r>
-        <w:rPr>
-          <w:sz w:val="22"/>
-          <w:szCs w:val="22"/>
-        </w:rPr>
-        <w:t xml:space="preserve">4.  </w:t>
-      </w:r>
-      <w:r>
-        <w:rPr>
-          <w:b/>
-          <w:bCs/>
-          <w:sz w:val="22"/>
-          <w:szCs w:val="22"/>
-        </w:rPr>
-        <w:t xml:space="preserve">Growing Up, Grandfather's Pride:</w:t>
-      </w:r>
-      <w:r>
-        <w:rPr>
-          <w:sz w:val="22"/>
-          <w:szCs w:val="22"/>
-        </w:rPr>
-        <w:t xml:space="preserve"> A final shot of a hand (Grandfather's) presenting a NEXT Gift Card. Grandfather then enters the frame with the child (age 8-9), now a pre-teen, dressed in a cool NEXT graphic tee and jeans, proudly showing off a school project, Grandfather beams with pride. On-screen text (Next Display Extended Medium, white on black): "THOUGHTFUL GIFTS, LASTING JOY."</w:t>
-      </w:r>
-    </w:p>
-    <w:p>
-      <w:r>
-        <w:rPr>
-          <w:sz w:val="22"/>
-          <w:szCs w:val="22"/>
-        </w:rPr>
-        <w:t xml:space="preserve">5.  </w:t>
-      </w:r>
-      <w:r>
-        <w:rPr>
-          <w:b/>
-          <w:bCs/>
-          <w:sz w:val="22"/>
-          <w:szCs w:val="22"/>
-        </w:rPr>
-        <w:t xml:space="preserve">The Endless Gift:</w:t>
-      </w:r>
-      <w:r>
-        <w:rPr>
-          <w:sz w:val="22"/>
-          <w:szCs w:val="22"/>
-        </w:rPr>
-        <w:t xml:space="preserve"> The final scene shows a collection of various physical NEXT Gift Cards fanned out, with a montage of quick cuts revisiting the child's different ages and outfits, reinforcing the continuous giving. Final CTA appears.</w:t>
+        <w:t xml:space="preserve">Scene 3:</w:t>
+      </w:r>
+      <w:r>
+        <w:rPr>
+          <w:sz w:val="22"/>
+          <w:szCs w:val="22"/>
+        </w:rPr>
+        <w:t xml:space="preserve"> (15-25s)</w:t>
+      </w:r>
+    </w:p>
+    <w:p>
+      <w:r>
+        <w:rPr>
+          <w:sz w:val="22"/>
+          <w:szCs w:val="22"/>
+        </w:rPr>
+        <w:t xml:space="preserve">The child rapidly growing. A montage of dynamic shots showing the child at different ages (from toddler to early school age) playing actively – running in a park, drawing, laughing. A quick visual transition (e.g., a wipe or fast cut) emphasizes how quickly they outgrow their clothes, showing a slightly-too-small outfit being replaced by a perfectly fitting one.</w:t>
+      </w:r>
+    </w:p>
+    <w:p>
+      <w:r>
+        <w:rPr>
+          <w:b/>
+          <w:bCs/>
+          <w:sz w:val="22"/>
+          <w:szCs w:val="22"/>
+        </w:rPr>
+        <w:t xml:space="preserve">VO:</w:t>
+      </w:r>
+      <w:r>
+        <w:rPr>
+          <w:sz w:val="22"/>
+          <w:szCs w:val="22"/>
+        </w:rPr>
+        <w:t xml:space="preserve"> Но децата растат толкова бързо... Едно мигване и любимите дрехи вече са малки. (But children grow so fast... One blink and favorite clothes are already small.)</w:t>
       </w:r>
     </w:p>
     <w:p/>
@@ -216,17 +215,219 @@
           <w:sz w:val="22"/>
           <w:szCs w:val="22"/>
         </w:rPr>
+        <w:t xml:space="preserve">Scene 4:</w:t>
+      </w:r>
+      <w:r>
+        <w:rPr>
+          <w:sz w:val="22"/>
+          <w:szCs w:val="22"/>
+        </w:rPr>
+        <w:t xml:space="preserve"> (25-35s)</w:t>
+      </w:r>
+    </w:p>
+    <w:p>
+      <w:r>
+        <w:rPr>
+          <w:sz w:val="22"/>
+          <w:szCs w:val="22"/>
+        </w:rPr>
+        <w:t xml:space="preserve">Parents exchange a knowing glance, perhaps looking at a pile of outgrown clothes or trying to guess a child's current size. The child is briefly seen expressing a new interest or wish. The scene captures the common dilemma parents face when choosing gifts, highlighting the uncertainty of size and evolving preferences.</w:t>
+      </w:r>
+    </w:p>
+    <w:p>
+      <w:r>
+        <w:rPr>
+          <w:b/>
+          <w:bCs/>
+          <w:sz w:val="22"/>
+          <w:szCs w:val="22"/>
+        </w:rPr>
+        <w:t xml:space="preserve">VO:</w:t>
+      </w:r>
+      <w:r>
+        <w:rPr>
+          <w:sz w:val="22"/>
+          <w:szCs w:val="22"/>
+        </w:rPr>
+        <w:t xml:space="preserve"> Какво да избереш, когато желанията им се променят всеки ден? Когато размерът е винаги загадка? (What to choose when their wishes change every day? When the size is always a mystery?)</w:t>
+      </w:r>
+    </w:p>
+    <w:p/>
+    <w:p>
+      <w:r>
+        <w:rPr>
+          <w:b/>
+          <w:bCs/>
+          <w:sz w:val="22"/>
+          <w:szCs w:val="22"/>
+        </w:rPr>
+        <w:t xml:space="preserve">Scene 5:</w:t>
+      </w:r>
+      <w:r>
+        <w:rPr>
+          <w:sz w:val="22"/>
+          <w:szCs w:val="22"/>
+        </w:rPr>
+        <w:t xml:space="preserve"> (35-45s)</w:t>
+      </w:r>
+    </w:p>
+    <w:p>
+      <w:r>
+        <w:rPr>
+          <w:sz w:val="22"/>
+          <w:szCs w:val="22"/>
+        </w:rPr>
+        <w:t xml:space="preserve">A moment of realization and relief on the parents' faces. A quick shot of a NEXT gift card, possibly being held by a parent or presented. The child is then shown happily browsing items in a bright, inviting store environment (or online on a tablet/phone), pointing at something they love, with parents smiling in approval.</w:t>
+      </w:r>
+    </w:p>
+    <w:p>
+      <w:r>
+        <w:rPr>
+          <w:b/>
+          <w:bCs/>
+          <w:sz w:val="22"/>
+          <w:szCs w:val="22"/>
+        </w:rPr>
+        <w:t xml:space="preserve">VO:</w:t>
+      </w:r>
+      <w:r>
+        <w:rPr>
+          <w:sz w:val="22"/>
+          <w:szCs w:val="22"/>
+        </w:rPr>
+        <w:t xml:space="preserve"> Подарете свободата да избират. Да намират точно това, което искат. С картата за подарък NEXT. (Give them the freedom to choose. To find exactly what they want. With a NEXT gift card.)</w:t>
+      </w:r>
+    </w:p>
+    <w:p>
+      <w:r>
+        <w:rPr>
+          <w:b/>
+          <w:bCs/>
+          <w:sz w:val="22"/>
+          <w:szCs w:val="22"/>
+        </w:rPr>
+        <w:t xml:space="preserve">VO:</w:t>
+      </w:r>
+      <w:r>
+        <w:rPr>
+          <w:sz w:val="22"/>
+          <w:szCs w:val="22"/>
+        </w:rPr>
+        <w:t xml:space="preserve"> Защото децата заслужават най-доброто. (Because children deserve the best.)</w:t>
+      </w:r>
+    </w:p>
+    <w:p/>
+    <w:p>
+      <w:r>
+        <w:rPr>
+          <w:b/>
+          <w:bCs/>
+          <w:sz w:val="22"/>
+          <w:szCs w:val="22"/>
+        </w:rPr>
+        <w:t xml:space="preserve">Scene 6:</w:t>
+      </w:r>
+      <w:r>
+        <w:rPr>
+          <w:sz w:val="22"/>
+          <w:szCs w:val="22"/>
+        </w:rPr>
+        <w:t xml:space="preserve"> (45-49s)</w:t>
+      </w:r>
+    </w:p>
+    <w:p>
+      <w:r>
+        <w:rPr>
+          <w:sz w:val="22"/>
+          <w:szCs w:val="22"/>
+        </w:rPr>
+        <w:t xml:space="preserve">A warm, final shot of the happy family (parents and child/children) together, perhaps holding hands or sharing a hug, framed intimately. The NEXT logo (white on black) appears clearly on screen, accompanied by the CTA text.</w:t>
+      </w:r>
+    </w:p>
+    <w:p>
+      <w:r>
+        <w:rPr>
+          <w:b/>
+          <w:bCs/>
+          <w:sz w:val="22"/>
+          <w:szCs w:val="22"/>
+        </w:rPr>
+        <w:t xml:space="preserve">VO:</w:t>
+      </w:r>
+      <w:r>
+        <w:rPr>
+          <w:sz w:val="22"/>
+          <w:szCs w:val="22"/>
+        </w:rPr>
+        <w:t xml:space="preserve"> Купете карта за подарък NEXT – те са най-добрият подарък за деца! (Buy a NEXT gift card – they make the best present for kids!)</w:t>
+      </w:r>
+    </w:p>
+    <w:p>
+      <w:r>
+        <w:rPr>
+          <w:b/>
+          <w:bCs/>
+          <w:sz w:val="22"/>
+          <w:szCs w:val="22"/>
+        </w:rPr>
+        <w:t xml:space="preserve">On-screen text:</w:t>
+      </w:r>
+      <w:r>
+        <w:rPr>
+          <w:sz w:val="22"/>
+          <w:szCs w:val="22"/>
+        </w:rPr>
+        <w:t xml:space="preserve"> (Next Display Extended Bold, #FFFFFF on #000000)</w:t>
+      </w:r>
+    </w:p>
+    <w:p>
+      <w:r>
+        <w:rPr>
+          <w:sz w:val="22"/>
+          <w:szCs w:val="22"/>
+        </w:rPr>
+        <w:t xml:space="preserve">NEXT Карта за Подарък</w:t>
+      </w:r>
+    </w:p>
+    <w:p>
+      <w:r>
+        <w:rPr>
+          <w:sz w:val="22"/>
+          <w:szCs w:val="22"/>
+        </w:rPr>
+        <w:t xml:space="preserve">Най-добрият подарък за деца!</w:t>
+      </w:r>
+    </w:p>
+    <w:p>
+      <w:r>
+        <w:rPr>
+          <w:sz w:val="22"/>
+          <w:szCs w:val="22"/>
+        </w:rPr>
+        <w:t xml:space="preserve">[NEXT Logo]</w:t>
+      </w:r>
+    </w:p>
+    <w:p/>
+    <w:p>
+      <w:r>
+        <w:rPr>
+          <w:b/>
+          <w:bCs/>
+          <w:sz w:val="22"/>
+          <w:szCs w:val="22"/>
+        </w:rPr>
         <w:t xml:space="preserve">Visual Style:</w:t>
       </w:r>
-      <w:r>
-        <w:rPr>
-          <w:sz w:val="22"/>
-          <w:szCs w:val="22"/>
-        </w:rPr>
-        <w:t xml:space="preserve"> Warm, inviting, and intimate. Soft, natural lighting creates a gentle glow around the subjects. Camera movements are smooth and fluid, often following the child's actions or the adult's loving gestures, maintaining a 9:16 vertical format. The colour palette for the environments is soft and homely, allowing the vibrant and stylish NEXT outfits to pop. Typography (following brand guidelines) and the NEXT logo are presented in crisp white on black or black on white, especially for text overlays and the final CTA.</w:t>
-      </w:r>
-    </w:p>
-    <w:p/>
+    </w:p>
+    <w:p>
+      <w:r>
+        <w:rPr>
+          <w:sz w:val="22"/>
+          <w:szCs w:val="22"/>
+        </w:rPr>
+        <w:t xml:space="preserve">The visual style is warm, authentic, and intimate, mirroring Style Inspiration 1. It uses soft, natural lighting with a slightly diffused feel. The camera work is handheld and dynamic for playful moments, but steady and close for tender interactions, all framed for a vertical 9:16 aspect ratio, emphasizing emotional connection. The colour palette is bright and fresh, with natural tones and pops of colour from children's clothing, contrasting with the clean black and white branding of NEXT for the end frame.</w:t>
+      </w:r>
+    </w:p>
     <w:p>
       <w:r>
         <w:rPr>
@@ -242,7 +443,7 @@
           <w:sz w:val="22"/>
           <w:szCs w:val="22"/>
         </w:rPr>
-        <w:t xml:space="preserve"> This concept directly addresses the user's feedback by showcasing different loved ones giving the gift of NEXT outfits through gift cards, reinforcing them as the perfect present for children, and naturally integrating the brand across various life stages.</w:t>
+        <w:t xml:space="preserve"> This concept directly implements the requested voiceover for the existing video's emotional narrative (Inspiration 1), while subtly reinterpreting the visual framing for 9:16 and integrating the brand message seamlessly, effectively resonating with the target audience of parents and expectant parents.</w:t>
       </w:r>
     </w:p>
     <w:p/>
@@ -376,16 +577,22 @@
                 <w:sz w:val="20"/>
                 <w:szCs w:val="20"/>
               </w:rPr>
-              <w:t xml:space="preserve">Scene 1: Title Introduction</w:t>
-            </w:r>
-          </w:p>
-          <w:p>
-            <w:r>
-              <w:rPr>
-                <w:sz w:val="20"/>
-                <w:szCs w:val="20"/>
-              </w:rPr>
-              <w:t xml:space="preserve">Opens with a soft, out-of-focus shot of gentle, diffused light, perhaps hinting at a cosy indoor setting. Slowly, the text "A Gift for Every Moment:" fades in, followed by "NEXT Generations" appearing below it. The typography is crisp white on a soft black background. A warm, inviting instrumental music track begins to gently swell.</w:t>
+              <w:t xml:space="preserve">Scene 1: A New Beginning</w:t>
+            </w:r>
+          </w:p>
+          <w:p>
+            <w:r>
+              <w:rPr>
+                <w:sz w:val="20"/>
+                <w:szCs w:val="20"/>
+              </w:rPr>
+              <w:t xml:space="preserve">(0-12s)
+**SOUND:** Gentle, ambient music begins (soft piano or lullaby-like melodies), establishing a warm and peaceful atmosphere. Faint, comforting sounds of a baby's soft coo or sigh.
+**VISUALS:**
+(0-3s) A soft focus close-up (9:16 vertical) on a newborn baby's tiny, wrinkled hand gently grasping a parent's finger. The lighting is incredibly warm and natural, creating a diffused, intimate glow on the skin.
+(3-6s) The camera slowly pulls back with a steady, tender movement to reveal the loving mother (young Caucasian woman, early 30s, natural makeup, soft, warm-toned casual clothing) gently kissing the baby's forehead. Her expression is pure adoration.
+(6-9s) Cut to the father (young Caucasian man, early 30s, casual, comfortable clothing) softly rocking the baby in his arms, a look of profound wonder and love on his face. He gently hums a quiet tune.
+(9-12s) A slightly wider, intimate shot (still 9:16 vertical) of both parents softly cuddling their infant in a cozy, sunlit nursery room. The camera remains steady, emphasizing the quiet, pure love and the start of their new journey together.</w:t>
             </w:r>
           </w:p>
         </w:tc>
@@ -407,7 +614,7 @@
                 <w:sz w:val="20"/>
                 <w:szCs w:val="20"/>
               </w:rPr>
-              <w:t xml:space="preserve">(Warm, inviting instrumental music begins)</w:t>
+              <w:t xml:space="preserve">VO: Един нов живот. Едно ново начало, изпълнено с обич и нежност. (A new life. A new beginning, filled with love and tenderness.)</w:t>
             </w:r>
           </w:p>
         </w:tc>
@@ -428,7 +635,7 @@
                 <w:sz w:val="18"/>
                 <w:szCs w:val="18"/>
               </w:rPr>
-              <w:t xml:space="preserve">A clean, minimalist black background with soft, diffused warm light edges. Text overlay: "A Gift for Every Moment:" (Next Display Extended Medium, white on black), then "NEXT Generations" (Next Display Extended Bold, white on black) fades in below. The overall mood is warm, inviting, and serene, matching the visual style's soft natural lighting and gentle glow, 9:16 vertical.</w:t>
+              <w:t xml:space="preserve">9:16 vertical video. A warm, authentic, intimate, and softly diffused scene. Close-up on a newborn Caucasian baby's tiny hand, gently gripping a young Caucasian mother's finger (early 30s, natural makeup, soft warm-toned clothing). Slow pull back to reveal the mother tenderly kissing the baby's forehead. Cut to a young Caucasian father (early 30s, casual warm-toned clothing) softly rocking the same baby, humming. Finally, a wider, steady shot of both parents cuddling their infant in a cozy, sunlit nursery. Soft, natural lighting, bright and fresh color palette. Handheld camera feel, close framing for emotional connection. Focus on tender moments, pure love.</w:t>
             </w:r>
           </w:p>
         </w:tc>
@@ -452,16 +659,22 @@
                 <w:sz w:val="20"/>
                 <w:szCs w:val="20"/>
               </w:rPr>
-              <w:t xml:space="preserve">Scene 2: The First Gift (Newborn)</w:t>
-            </w:r>
-          </w:p>
-          <w:p>
-            <w:r>
-              <w:rPr>
-                <w:sz w:val="20"/>
-                <w:szCs w:val="20"/>
-              </w:rPr>
-              <w:t xml:space="preserve">A warm, close-up shot of an older, gentle hand (Grandma's) entering the frame, carefully presenting a shining physical NEXT Gift Card. The gift card is clearly visible, showing its multi-coloured polka dot design and "NEXT GIFT CARD" text. A quick, smooth cut transitions to Grandma entering the frame, lovingly cradling a newborn baby (child age 0-1 months) dressed in a pristine white NEXT sleepsuit. Grandma smiles warmly at the baby. The camera holds a medium shot, slightly from below, capturing their tender interaction. On-screen text appears.</w:t>
+              <w:t xml:space="preserve">Scene 2: First Milestones and Gifts</w:t>
+            </w:r>
+          </w:p>
+          <w:p>
+            <w:r>
+              <w:rPr>
+                <w:sz w:val="20"/>
+                <w:szCs w:val="20"/>
+              </w:rPr>
+              <w:t xml:space="preserve">(12-27s)
+**SOUND:** Music becomes slightly more playful and light-hearted, maintaining a warm tone. Giggles, soft shuffling sounds, faint clatter of a toy.
+**VISUALS:**
+(12-17s) Quick cuts with a dynamic, handheld camera (9:16 vertical), showcasing the same child (now a toddler, around 1-2 years old, dressed in bright, natural-toned children's clothing). We see wobbly first steps across a soft living room rug, followed by joyous giggling as they playfully tumble.
+(17-21s) The toddler, eyes wide with wonder, discovering new textures – running small fingers over a soft blanket, then curiously tapping a simple wooden toy. Close-ups on their curious hands and expressive, joyful face.
+(21-24s) A playful moment: the toddler is blowing bubbles in a bright, sunlit garden, laughing delightedly. The parents (same couple) are visible in the soft-focus background, smiling fondly.
+(24-27s) Glimpses of small, thoughtful gifts being opened: soft, colourful baby clothes, a simple wooden block set. The child claps their hands in delight, emphasizing the family's shared joy. The camera focuses on the child's genuine reaction.</w:t>
             </w:r>
           </w:p>
         </w:tc>
@@ -483,7 +696,7 @@
                 <w:sz w:val="20"/>
                 <w:szCs w:val="20"/>
               </w:rPr>
-              <w:t xml:space="preserve">(Soft, warm narrator voiceover) "For every precious first..."</w:t>
+              <w:t xml:space="preserve">VO: Всяка усмивка, всяка първа крачка е празник. А подаръците от близките – част от магията. (Every smile, every first step is a celebration. And gifts from loved ones – part of the magic.)</w:t>
             </w:r>
           </w:p>
         </w:tc>
@@ -504,7 +717,7 @@
                 <w:sz w:val="18"/>
                 <w:szCs w:val="18"/>
               </w:rPr>
-              <w:t xml:space="preserve">Close-up of a gentle, older female hand (Grandma's) presenting a physical NEXT Gift Card. The card features a multi-coloured polka dot design on a white background with "NEXT GIFT CARD" in navy text, precisely matching '1_images_from_folder'. The hand is sharply in focus, with a soft, warm background blur. Transition to a medium shot of Grandma, a woman of diverse ethnicity, lovingly cradling a newborn baby (0-1 months) in her arms. The baby is dressed in a pristine white NEXT sleepsuit. Grandma beams with warmth, making eye contact with the baby. The setting is a warm, homely nursery, bathed in soft, diffuse natural light creating a gentle glow. Shallow depth of field blurs the background. Camera is slightly low angle, smoothly tracking. High saturation on the baby's outfit. Overall visual style matches 'YOUNGER GIRLS audio 2a.mp4' in terms of lighting, saturation, contrast, and mood. 9:16 vertical format. Text overlay: "THE GIFT OF FIRSTS." (Next Display Extended Bold, white on black).</w:t>
+              <w:t xml:space="preserve">9:16 vertical video. A warm, authentic, and intimate scene with soft, natural lighting. Dynamic handheld camera. Quick cuts showcasing the same Caucasian child (toddler, 1-2 years old, in bright, natural-toned children's clothing) taking wobbly first steps on a soft rug, giggling. Close-ups of the toddler's hands discovering textures. The child blowing bubbles in a sunlit garden with smiling Caucasian parents (same family) in soft-focus background. Glimpses of small, thoughtful gifts (soft clothes, wooden toy) being opened, focusing on the child's happy reactions. Bright and fresh color palette with pops of color.</w:t>
             </w:r>
           </w:p>
         </w:tc>
@@ -528,16 +741,21 @@
                 <w:sz w:val="20"/>
                 <w:szCs w:val="20"/>
               </w:rPr>
-              <w:t xml:space="preserve">Scene 3: Playful Steps, Aunt's Joy (Toddler)</w:t>
-            </w:r>
-          </w:p>
-          <w:p>
-            <w:r>
-              <w:rPr>
-                <w:sz w:val="20"/>
-                <w:szCs w:val="20"/>
-              </w:rPr>
-              <w:t xml:space="preserve">A new shot featuring a different, slightly younger female hand (Aunt's) presenting another physical NEXT Gift Card, identical in design. A quick, smooth cut transitions to the Aunt entering the frame, laughing joyfully as she gently guides the same child (age 2-3 years), now a playful toddler, taking wobbly steps across a bright, comfortable living room floor. The child is dressed in a colourful NEXT dungaree set. The camera follows their movement, maintaining a medium shot, slightly from below. On-screen text appears.</w:t>
+              <w:t xml:space="preserve">Scene 3: Growing Up So Fast</w:t>
+            </w:r>
+          </w:p>
+          <w:p>
+            <w:r>
+              <w:rPr>
+                <w:sz w:val="20"/>
+                <w:szCs w:val="20"/>
+              </w:rPr>
+              <w:t xml:space="preserve">(27-42s)
+**SOUND:** Music softens slightly during the transition, then picks up a gentle, flowing, slightly energetic pace. Faint sounds of children playing and general household ambiance.
+**VISUALS:**
+(27-32s) A montage of dynamic, active shots (9:16 vertical) showing the child (the same child, now transitioning from toddler to early school age, approximately 3-5 years old). Scenes include running energetically in a vibrant park with autumn leaves, happily drawing with brightly coloured crayons at a small, child-sized table, and laughing heartily while being playfully chased by a parent. Each shot captures their rapid growth and increasing activity.
+(32-37s) A quick visual transition (e.g., a rapid wipe or fast cut) emphasizes how quickly children outgrow their clothes. Show the child trying on a slightly-too-small outfit (e.g., pants that are clearly too short, a shirt that's too tight). The child looks a bit uncomfortable, perhaps trying to pull down the sleeves or adjust the waistband, with a comical or resigned expression.
+(37-42s) Immediately following, the child is seen excitedly putting on a perfectly fitting, new outfit, looking pleased and comfortable. The contrast visually highlights the rapid growth. The parents are seen smiling in the background, perhaps exchanging a knowing, slightly amused look.</w:t>
             </w:r>
           </w:p>
         </w:tc>
@@ -559,7 +777,7 @@
                 <w:sz w:val="20"/>
                 <w:szCs w:val="20"/>
               </w:rPr>
-              <w:t xml:space="preserve">(Narrator voiceover continues) "...and every joyful step."</w:t>
+              <w:t xml:space="preserve">VO: Но децата растат толкова бързо... Едно мигване и любимите дрехи вече са малки. (But children grow so fast... One blink and favorite clothes are already small.)</w:t>
             </w:r>
           </w:p>
         </w:tc>
@@ -580,7 +798,7 @@
                 <w:sz w:val="18"/>
                 <w:szCs w:val="18"/>
               </w:rPr>
-              <w:t xml:space="preserve">Close-up of a youthful female hand (Aunt's) presenting a physical NEXT Gift Card, featuring the multi-coloured polka dot design on white background with "NEXT GIFT CARD" in navy text, precisely matching '1_images_from_folder'. Transition to a medium shot of the Aunt, a woman of diverse ethnicity, laughing as she guides the same child (age 2-3, toddler) taking wobbly steps. The child wears a colourful, age-appropriate NEXT dungaree set. The setting is a bright, comfortable indoor play area or living room with soft, homely colours. Soft, diffuse natural light illuminates the scene, making the child's outfit pop. Shallow depth of field keeps the child and Aunt in sharp focus. Camera is smoothly tracking their movement, slightly low angle. High saturation on the child's outfit. Overall visual style matches 'YOUNGER GIRLS audio 2a.mp4' in terms of vibrant outfits, diffuse lighting, cheerful mood, saturation, and contrast. 9:16 vertical format. Text overlay: "LOVED ONES MAKE MEMORIES." (Next Display Extended Medium, white on black).</w:t>
+              <w:t xml:space="preserve">9:16 vertical video. A warm, authentic, intimate scene with bright, natural lighting. A montage of dynamic handheld shots featuring the same Caucasian child (aged 3-5, wearing varied, colourful children's clothing) running energetically in a vibrant park, drawing with crayons at a table, and laughing while being chased by a parent. Quick visual transition (wipe) showing the child trying on a slightly-too-small outfit (too-short pants, tight shirt), looking uncomfortable. Immediately cut to the child happily putting on a perfectly fitting new outfit, looking pleased. Same Caucasian parents are present, smiling softly in the background. Bright and fresh color palette.</w:t>
             </w:r>
           </w:p>
         </w:tc>
@@ -604,16 +822,22 @@
                 <w:sz w:val="20"/>
                 <w:szCs w:val="20"/>
               </w:rPr>
-              <w:t xml:space="preserve">Scene 4: Confident Explorer, Friend's Fun (Young Child)</w:t>
-            </w:r>
-          </w:p>
-          <w:p>
-            <w:r>
-              <w:rPr>
-                <w:sz w:val="20"/>
-                <w:szCs w:val="20"/>
-              </w:rPr>
-              <w:t xml:space="preserve">Another distinct, active hand (a family friend's) presents an identical physical NEXT Gift Card. A quick, smooth cut transitions to the Family Friend entering the frame with the child (age 5-6 years), now a confident young explorer. The child is dressed in a vibrant NEXT jacket and jeans. They are playfully chasing each other through a lush green park, giggling, before sharing a joyful high-five. The camera smoothly tracks their energetic movement, maintaining a medium shot, slightly from below. On-screen text appears.</w:t>
+              <w:t xml:space="preserve">Scene 4: The Gifting Dilemma</w:t>
+            </w:r>
+          </w:p>
+          <w:p>
+            <w:r>
+              <w:rPr>
+                <w:sz w:val="20"/>
+                <w:szCs w:val="20"/>
+              </w:rPr>
+              <w:t xml:space="preserve">(42-57s)
+**SOUND:** Music becomes slightly more reflective and thoughtful, with a hint of a playful mystery. Soft ambient room sounds, rustling of fabric.
+**VISUALS:**
+(42-47s) The parents (same young Caucasian couple, early 30s) exchange a knowing, slightly exasperated glance while looking at a pile of colourful, but clearly outgrown, children's clothes on a chair or bed. They sigh playfully, acknowledging the constant cycle. Camera is steady, medium shot (9:16 vertical).
+(47-51s) Cut to the child (same child, now around 5-7 years old, dressed in comfortable, age-appropriate clothing) briefly seen expressing a new interest or wish – perhaps pointing enthusiastically at a picture in a brightly illustrated book (e.g., a dinosaur, a space rocket, a fairy castle) or excitedly talking about a new hobby they've discovered. Their interests are clearly evolving rapidly.
+(51-54s) Back to the parents, a close-up on their faces as they thoughtfully try to guess the child's current size or what specific item they might like. One parent holds up a measuring tape, looking puzzled, while the other shrugs with a gentle, understanding smile.
+(54-57s) A slightly wider shot shows the parents looking a little perplexed but still loving, perhaps with a hand on their chin or a thoughtful gaze. The scene effectively captures the common dilemma parents face when trying to choose the perfect, suitable gift amidst evolving preferences and sizes.</w:t>
             </w:r>
           </w:p>
         </w:tc>
@@ -635,7 +859,7 @@
                 <w:sz w:val="20"/>
                 <w:szCs w:val="20"/>
               </w:rPr>
-              <w:t xml:space="preserve">(Narrator voiceover continues) "Style that grows with them..."</w:t>
+              <w:t xml:space="preserve">VO: Какво да избереш, когато желанията им се променят всеки ден? Когато размерът е винаги загадка? (What to choose when their wishes change every day? When the size is always a mystery?)</w:t>
             </w:r>
           </w:p>
         </w:tc>
@@ -656,7 +880,7 @@
                 <w:sz w:val="18"/>
                 <w:szCs w:val="18"/>
               </w:rPr>
-              <w:t xml:space="preserve">Close-up of an active male hand (Family Friend's) presenting a physical NEXT Gift Card, featuring the multi-coloured polka dot design on white background with "NEXT GIFT CARD" in navy text, precisely matching '1_images_from_folder'. Transition to a medium shot of the Family Friend, a man of diverse ethnicity, playfully chasing the same child (age 5-6) through a lush green park. The child wears a vibrant NEXT jacket and jeans. They share a joyful high-five. The setting is an open, expansive grassy field with distant trees under a soft, overcast sky, matching the 'YOUNGER GIRLS audio 2a.mp4' environment. Soft, diffuse daylight creates a bright and cheerful feel, making the vibrant NEXT outfit pop. Shallow depth of field blurs the background. Camera is smoothly tracking their energetic movement, slightly low angle. High saturation on outfits and natural environment. Overall visual style matches 'YOUNGER GIRLS audio 2a.mp4' in all aspects: vibrant outfits, park setting, diffuse daylight, high saturation, joyful expressions, and compositional rules. 9:16 vertical format. Text overlay: "STYLE THAT GROWS WITH THEM." (Next Display Extended Bold, white on black).</w:t>
+              <w:t xml:space="preserve">9:16 vertical video. A warm, authentic, intimate scene with natural, soft lighting. The same young Caucasian parents (early 30s) exchange a knowing, slightly exasperated glance as they look at a pile of colourful outgrown children's clothes. Cut to a medium shot of the same Caucasian child (aged 5-7, casual clothing) animatedly pointing at a picture in a book (e.g., space-themed) or explaining a new hobby, showcasing evolving interests. Return to a close-up of the parents' thoughtful expressions, one holding a measuring tape, the other shrugging. A slightly wider shot emphasizes their shared dilemma. Bright and fresh color palette.</w:t>
             </w:r>
           </w:p>
         </w:tc>
@@ -680,16 +904,23 @@
                 <w:sz w:val="20"/>
                 <w:szCs w:val="20"/>
               </w:rPr>
-              <w:t xml:space="preserve">Scene 5: Growing Up, Grandfather's Pride (Pre-teen)</w:t>
-            </w:r>
-          </w:p>
-          <w:p>
-            <w:r>
-              <w:rPr>
-                <w:sz w:val="20"/>
-                <w:szCs w:val="20"/>
-              </w:rPr>
-              <w:t xml:space="preserve">A final shot of a wise, older male hand (Grandfather's) presenting an identical physical NEXT Gift Card. A quick, smooth cut transitions to Grandfather entering the frame with the child (age 8-9 years), now a pre-teen. The child is dressed in a cool NEXT graphic tee and jeans. The child proudly shows off a school project, and Grandfather beams with pride, placing a gentle hand on their shoulder. The camera captures this heartwarming moment in a medium shot, with a gentle pan, slightly from below. On-screen text appears.</w:t>
+              <w:t xml:space="preserve">Scene 5: The Perfect Solution</w:t>
+            </w:r>
+          </w:p>
+          <w:p>
+            <w:r>
+              <w:rPr>
+                <w:sz w:val="20"/>
+                <w:szCs w:val="20"/>
+              </w:rPr>
+              <w:t xml:space="preserve">(57-77s)
+**SOUND:** Music brightens significantly, becoming more uplifting and hopeful. Soft ambient store sounds (e.g., distant chatter, gentle music) or cheerful online browsing sounds (e.g., soft clicks, digital swooshes).
+**VISUALS:**
+(57-61s) A moment of clear realization and relief spreads across the parents' faces (same couple). Their expressions shift from puzzlement to a subtle, joyful "aha!" The camera is steady, capturing their genuine smiles.
+(61-65s) A quick, clear, and vibrant shot (close-up, 9:16 vertical) of a pristine NEXT gift card being held elegantly by one of the parents. The card's design is crisp, inviting, and clearly visible.
+(65-69s) The child (same child, 5-7 years old), accompanied by their smiling parents, is then shown happily browsing items in a bright, inviting NEXT store environment. The child's face is alight with excitement as they point animatedly at a toy or an item of clothing they genuinely love.
+(69-73s) Another shot of the child and parents, this time comfortably browsing the NEXT online store on a tablet or phone. The child, with their finger, enthusiastically clicks on an item, while the parents smile approvingly, happy to see their child making their own choice.
+(73-77s) The child is seen holding a newly chosen item (e.g., a cherished book, a small toy, a stylish new shirt) with a wide, genuine, delighted smile. The parents share a warm, joyful look, satisfied that they've given the perfect gift.</w:t>
             </w:r>
           </w:p>
         </w:tc>
@@ -711,7 +942,8 @@
                 <w:sz w:val="20"/>
                 <w:szCs w:val="20"/>
               </w:rPr>
-              <w:t xml:space="preserve">(Narrator voiceover continues) "...creating lasting memories."</w:t>
+              <w:t xml:space="preserve">VO: Подарете свободата да избират. Да намират точно това, което искат. С картата за подарък NEXT. (Give them the freedom to choose. To find exactly what they want. With a NEXT gift card.)
+VO: Защото децата заслужават най-доброто. (Because children deserve the best.)</w:t>
             </w:r>
           </w:p>
         </w:tc>
@@ -732,7 +964,7 @@
                 <w:sz w:val="18"/>
                 <w:szCs w:val="18"/>
               </w:rPr>
-              <w:t xml:space="preserve">Close-up of a wise, older male hand (Grandfather's) presenting a physical NEXT Gift Card, featuring the multi-coloured polka dot design on white background with "NEXT GIFT CARD" in navy text, precisely matching '1_images_from_folder'. Transition to a medium shot of the Grandfather, a man of diverse ethnicity, with the same child (age 8-9, pre-teen). The child is dressed in a cool NEXT graphic tee and jeans, proudly showing off a school project. Grandfather beams with pride. The setting is a cozy home study or living room, with soft, homely colours. Soft, diffuse natural light creates a gentle glow around the subjects. Shallow depth of field for clear focus on the subjects. Camera maintains a slightly low angle with a gentle pan. High saturation on the child's outfit. Overall visual style matches 'YOUNGER GIRLS audio 2a.mp4' in terms of warm, inviting lighting, balanced contrast, and mood. 9:16 vertical format. Text overlay: "THOUGHTFUL GIFTS, LASTING JOY." (Next Display Extended Medium, white on black).</w:t>
+              <w:t xml:space="preserve">9:16 vertical video. A warm, authentic scene with bright, inviting lighting. Close-up on the same young Caucasian parents (early 30s) as realization and relief spreads across their faces. A quick, clear close-up shot of a pristine NEXT gift card held by one parent. The same Caucasian child (aged 5-7, casual clothing), accompanied by their smiling parents, happily browsing items in a brightly lit, inviting NEXT store environment, pointing excitedly at something they love. Cut to the child and parents browsing the NEXT online store on a tablet, the child enthusiastically clicking on an item. Finally, the child beaming, holding a newly chosen item (e.g., a book, toy, or clothing) from NEXT, parents smiling joyfully in the background. Fresh and modern color palette.</w:t>
             </w:r>
           </w:p>
         </w:tc>
@@ -756,16 +988,21 @@
                 <w:sz w:val="20"/>
                 <w:szCs w:val="20"/>
               </w:rPr>
-              <w:t xml:space="preserve">Scene 6: The Endless Gift - Montage</w:t>
-            </w:r>
-          </w:p>
-          <w:p>
-            <w:r>
-              <w:rPr>
-                <w:sz w:val="20"/>
-                <w:szCs w:val="20"/>
-              </w:rPr>
-              <w:t xml:space="preserve">The screen is filled with a dynamic display of multiple physical NEXT Gift Cards, fanned out or playfully arranged, all clearly showing their multi-coloured polka dot design and "NEXT GIFT CARD" text. This then dissolves into a rapid montage of quick cuts, revisiting the child from previous scenes at different ages (newborn, toddler, young child, pre-teen), showcasing various stylish NEXT outfits and the joyful interactions with their loved ones. Each cut is brief and highlights a happy moment, reinforcing the continuous giving and growth. Music swells slightly.</w:t>
+              <w:t xml:space="preserve">Scene 6: The Best Gift for Kids</w:t>
+            </w:r>
+          </w:p>
+          <w:p>
+            <w:r>
+              <w:rPr>
+                <w:sz w:val="20"/>
+                <w:szCs w:val="20"/>
+              </w:rPr>
+              <w:t xml:space="preserve">(77-90s)
+**SOUND:** Music swells to a warm, uplifting crescendo, then gently fades out, leaving a positive and lasting impression.
+**VISUALS:**
+(77-83s) A warm, intimate, and final shot (9:16 vertical) of the happy family (parents and child/children, the same Caucasian family from earlier scenes) together. They share a loving group hug, looking genuinely content, connected, and full of joy. The lighting is soft and golden, enhancing the emotional warmth.
+(83-87s) The family's loving embrace gracefully dissolves or transitions with a clean fade into a solid black background. The NEXT logo (white on black) appears clearly on screen, animating smoothly and prominently.
+(87-90s) Accompanying text, rendered in a crisp, modern, bold font (Next Display Extended Bold, #FFFFFF on #000000), appears below the logo, reinforcing the brand's message and call to action.</w:t>
             </w:r>
           </w:p>
         </w:tc>
@@ -787,7 +1024,11 @@
                 <w:sz w:val="20"/>
                 <w:szCs w:val="20"/>
               </w:rPr>
-              <w:t xml:space="preserve">(Narrator voiceover) "A NEXT Gift Card: the perfect present, for every moment, every age."</w:t>
+              <w:t xml:space="preserve">VO: Купете карта за подарък NEXT – те са най-добрият подарък за деца! (Buy a NEXT gift card – they make the best present for kids!)
+**On-screen text:** (Next Display Extended Bold, #FFFFFF on #000000)
+NEXT Карта за Подарък
+Най-добрият подарък за деца!
+[NEXT Logo]</w:t>
             </w:r>
           </w:p>
         </w:tc>
@@ -808,89 +1049,7 @@
                 <w:sz w:val="18"/>
                 <w:szCs w:val="18"/>
               </w:rPr>
-              <w:t xml:space="preserve">A dynamic arrangement of multiple physical NEXT Gift Cards, fanned out or creatively displayed, all featuring the multi-coloured polka dot design on white background with "NEXT GIFT CARD" in navy text, precisely matching '1_images_from_folder'. Flat, even lighting on the cards. This transitions to a rapid montage of quick cuts:
-1.  Medium shot of Newborn (0-1) in white NEXT sleepsuit with Grandma, warm home setting.
-2.  Medium shot of Toddler (2-3) in colourful NEXT dungarees with Aunt, playful steps in bright indoor area.
-3.  Medium shot of Child (5-6) in vibrant NEXT jacket with Family Friend, joyful high-five in a lush park.
-4.  Medium shot of Pre-teen (8-9) in cool NEXT graphic tee and jeans with Grandfather, proudly showing project in cozy home.
-All montage shots maintain: same child, age-appropriate NEXT outfits, joyful expressions, medium shots, slightly low angle, soft natural lighting, high saturation on outfits, shallow depth of field, 9:16 vertical format. The visual style of all montage clips strictly matches 'YOUNGER GIRLS audio 2a.mp4' (vibrant, natural, diffuse daylight, balanced contrast, high saturation, cheerful mood).</w:t>
-            </w:r>
-          </w:p>
-        </w:tc>
-      </w:tr>
-      <w:tr>
-        <w:tc>
-          <w:tcPr>
-            <w:tcW w:type="pct" w:w="33%"/>
-            <w:tcBorders>
-              <w:top w:val="single" w:color="CCCCCC" w:sz="1"/>
-              <w:left w:val="single" w:color="CCCCCC" w:sz="1"/>
-              <w:bottom w:val="single" w:color="CCCCCC" w:sz="1"/>
-              <w:right w:val="single" w:color="CCCCCC" w:sz="1"/>
-            </w:tcBorders>
-          </w:tcPr>
-          <w:p>
-            <w:r>
-              <w:rPr>
-                <w:b/>
-                <w:bCs/>
-                <w:sz w:val="20"/>
-                <w:szCs w:val="20"/>
-              </w:rPr>
-              <w:t xml:space="preserve">Scene 7: Final Call to Action</w:t>
-            </w:r>
-          </w:p>
-          <w:p>
-            <w:r>
-              <w:rPr>
-                <w:sz w:val="20"/>
-                <w:szCs w:val="20"/>
-              </w:rPr>
-              <w:t xml:space="preserve">The montage fades out to a clean, crisp black background. The bold, white "NEXT" logo (matching typography from gift card ref) appears centrally, followed by the Call-to-Action text. The warm instrumental music gently fades out.</w:t>
-            </w:r>
-          </w:p>
-        </w:tc>
-        <w:tc>
-          <w:tcPr>
-            <w:tcW w:type="pct" w:w="33%"/>
-            <w:tcBorders>
-              <w:top w:val="single" w:color="CCCCCC" w:sz="1"/>
-              <w:left w:val="single" w:color="CCCCCC" w:sz="1"/>
-              <w:bottom w:val="single" w:color="CCCCCC" w:sz="1"/>
-              <w:right w:val="single" w:color="CCCCCC" w:sz="1"/>
-            </w:tcBorders>
-          </w:tcPr>
-          <w:p>
-            <w:r>
-              <w:rPr>
-                <w:i/>
-                <w:iCs/>
-                <w:sz w:val="20"/>
-                <w:szCs w:val="20"/>
-              </w:rPr>
-              <w:t xml:space="preserve">(Music gently fades out)</w:t>
-            </w:r>
-          </w:p>
-        </w:tc>
-        <w:tc>
-          <w:tcPr>
-            <w:tcW w:type="pct" w:w="34%"/>
-            <w:tcBorders>
-              <w:top w:val="single" w:color="CCCCCC" w:sz="1"/>
-              <w:left w:val="single" w:color="CCCCCC" w:sz="1"/>
-              <w:bottom w:val="single" w:color="CCCCCC" w:sz="1"/>
-              <w:right w:val="single" w:color="CCCCCC" w:sz="1"/>
-            </w:tcBorders>
-          </w:tcPr>
-          <w:p>
-            <w:r>
-              <w:rPr>
-                <w:rFonts w:ascii="Consolas" w:cs="Consolas" w:eastAsia="Consolas" w:hAnsi="Consolas"/>
-                <w:sz w:val="18"/>
-                <w:szCs w:val="18"/>
-              </w:rPr>
-              <w:t xml:space="preserve">A clean, crisp black background. The bold, white "NEXT" logo (matching the sans-serif typeface and weight from '1_images_from_folder') appears centrally. Below it, text overlay: "A Gift for Every Moment. Shop NEXT Gift Cards today." (Next Display Extended Medium, white on black). The overall aesthetic is minimalist, high contrast, and adheres to the brand's typography style. 9:16 vertical format.
-***</w:t>
+              <w:t xml:space="preserve">9:16 vertical video. A warm, intimate, and authentic final scene with soft, golden natural lighting. The same happy Caucasian family (parents and child, all smiling genuinely) sharing a loving group hug, looking content and connected. The scene gracefully transitions to a clean, solid black background. A crisp, white NEXT logo appears, animated smoothly onto the black screen. Below the logo, the text "NEXT Карта за Подарък" and "Най-добрият подарък за деца!" appears in white, bold, modern font (Next Display Extended Bold) on the black background. The visual style is warm and emotional for the family scene, transitioning to clean, professional, and impactful for the branding.</w:t>
             </w:r>
           </w:p>
         </w:tc>

</xml_diff>